<commit_message>
Add late fee indicator, WiFi details, and front door code features
</commit_message>
<xml_diff>
--- a/property-management/Lease Agreeement Asif Oct 2026 to Oct 2027.docx
+++ b/property-management/Lease Agreeement Asif Oct 2026 to Oct 2027.docx
@@ -1,6 +1,6 @@
 
 <file path=word/document.xml><?xml version="1.0" encoding="utf-8"?>
-<w:document xmlns:wpc="http://schemas.microsoft.com/office/word/2010/wordprocessingCanvas" xmlns:cx="http://schemas.microsoft.com/office/drawing/2014/chartex" xmlns:cx1="http://schemas.microsoft.com/office/drawing/2015/9/8/chartex" xmlns:cx2="http://schemas.microsoft.com/office/drawing/2015/10/21/chartex" xmlns:cx3="http://schemas.microsoft.com/office/drawing/2016/5/9/chartex" xmlns:cx4="http://schemas.microsoft.com/office/drawing/2016/5/10/chartex" xmlns:cx5="http://schemas.microsoft.com/office/drawing/2016/5/11/chartex" xmlns:cx6="http://schemas.microsoft.com/office/drawing/2016/5/12/chartex" xmlns:cx7="http://schemas.microsoft.com/office/drawing/2016/5/13/chartex" xmlns:cx8="http://schemas.microsoft.com/office/drawing/2016/5/14/chartex" xmlns:mc="http://schemas.openxmlformats.org/markup-compatibility/2006" xmlns:aink="http://schemas.microsoft.com/office/drawing/2016/ink" xmlns:am3d="http://schemas.microsoft.com/office/drawing/2017/model3d" xmlns:o="urn:schemas-microsoft-com:office:office" xmlns:oel="http://schemas.microsoft.com/office/2019/extlst" xmlns:r="http://schemas.openxmlformats.org/officeDocument/2006/relationships" xmlns:m="http://schemas.openxmlformats.org/officeDocument/2006/math" xmlns:v="urn:schemas-microsoft-com:vml" xmlns:wp14="http://schemas.microsoft.com/office/word/2010/wordprocessingDrawing" xmlns:wp="http://schemas.openxmlformats.org/drawingml/2006/wordprocessingDrawing" xmlns:w10="urn:schemas-microsoft-com:office:word" xmlns:w="http://schemas.openxmlformats.org/wordprocessingml/2006/main" xmlns:w14="http://schemas.microsoft.com/office/word/2010/wordml" xmlns:w15="http://schemas.microsoft.com/office/word/2012/wordml" xmlns:w16cei="http://schemas.microsoft.com/office/word/2026/wordml/cei" xmlns:w16cex="http://schemas.microsoft.com/office/word/2018/wordml/cex" xmlns:w16cid="http://schemas.microsoft.com/office/word/2016/wordml/cid" xmlns:w16="http://schemas.microsoft.com/office/word/2018/wordml" xmlns:w16du="http://schemas.microsoft.com/office/word/2023/wordml/word16du" xmlns:w16sdtdh="http://schemas.microsoft.com/office/word/2020/wordml/sdtdatahash" xmlns:w16sdtfl="http://schemas.microsoft.com/office/word/2024/wordml/sdtformatlock" xmlns:w16se="http://schemas.microsoft.com/office/word/2015/wordml/symex" xmlns:wpg="http://schemas.microsoft.com/office/word/2010/wordprocessingGroup" xmlns:wpi="http://schemas.microsoft.com/office/word/2010/wordprocessingInk" xmlns:wne="http://schemas.microsoft.com/office/word/2006/wordml" xmlns:wps="http://schemas.microsoft.com/office/word/2010/wordprocessingShape" mc:Ignorable="w14 w15 w16se w16cid w16 w16cex w16sdtdh w16sdtfl w16du wp14">
+<w:document xmlns:wpc="http://schemas.microsoft.com/office/word/2010/wordprocessingCanvas" xmlns:cx="http://schemas.microsoft.com/office/drawing/2014/chartex" xmlns:cx1="http://schemas.microsoft.com/office/drawing/2015/9/8/chartex" xmlns:cx2="http://schemas.microsoft.com/office/drawing/2015/10/21/chartex" xmlns:cx3="http://schemas.microsoft.com/office/drawing/2016/5/9/chartex" xmlns:cx4="http://schemas.microsoft.com/office/drawing/2016/5/10/chartex" xmlns:cx5="http://schemas.microsoft.com/office/drawing/2016/5/11/chartex" xmlns:cx6="http://schemas.microsoft.com/office/drawing/2016/5/12/chartex" xmlns:cx7="http://schemas.microsoft.com/office/drawing/2016/5/13/chartex" xmlns:cx8="http://schemas.microsoft.com/office/drawing/2016/5/14/chartex" xmlns:mc="http://schemas.openxmlformats.org/markup-compatibility/2006" xmlns:aink="http://schemas.microsoft.com/office/drawing/2016/ink" xmlns:am3d="http://schemas.microsoft.com/office/drawing/2017/model3d" xmlns:o="urn:schemas-microsoft-com:office:office" xmlns:oel="http://schemas.microsoft.com/office/2019/extlst" xmlns:r="http://schemas.openxmlformats.org/officeDocument/2006/relationships" xmlns:m="http://schemas.openxmlformats.org/officeDocument/2006/math" xmlns:v="urn:schemas-microsoft-com:vml" xmlns:wp14="http://schemas.microsoft.com/office/word/2010/wordprocessingDrawing" xmlns:wp="http://schemas.openxmlformats.org/drawingml/2006/wordprocessingDrawing" xmlns:w10="urn:schemas-microsoft-com:office:word" xmlns:w="http://schemas.openxmlformats.org/wordprocessingml/2006/main" xmlns:w14="http://schemas.microsoft.com/office/word/2010/wordml" xmlns:w15="http://schemas.microsoft.com/office/word/2012/wordml" xmlns:w16cex="http://schemas.microsoft.com/office/word/2018/wordml/cex" xmlns:w16cid="http://schemas.microsoft.com/office/word/2016/wordml/cid" xmlns:w16="http://schemas.microsoft.com/office/word/2018/wordml" xmlns:w16du="http://schemas.microsoft.com/office/word/2023/wordml/word16du" xmlns:w16sdtdh="http://schemas.microsoft.com/office/word/2020/wordml/sdtdatahash" xmlns:w16sdtfl="http://schemas.microsoft.com/office/word/2024/wordml/sdtformatlock" xmlns:w16se="http://schemas.microsoft.com/office/word/2015/wordml/symex" xmlns:wpg="http://schemas.microsoft.com/office/word/2010/wordprocessingGroup" xmlns:wpi="http://schemas.microsoft.com/office/word/2010/wordprocessingInk" xmlns:wne="http://schemas.microsoft.com/office/word/2006/wordml" xmlns:wps="http://schemas.microsoft.com/office/word/2010/wordprocessingShape" mc:Ignorable="w14 w15 w16se w16cid w16 w16cex w16sdtdh w16sdtfl w16du wp14">
   <w:body>
     <w:p>
       <w:pPr>
@@ -260,6 +260,13 @@
       </w:r>
     </w:p>
     <w:p>
+      <w:pPr>
+        <w:rPr>
+          <w:color w:val="666666"/>
+          <w:sz w:val="19"/>
+          <w:szCs w:val="19"/>
+        </w:rPr>
+      </w:pPr>
       <w:r>
         <w:t xml:space="preserve">This Agreement shall commence on </w:t>
       </w:r>
@@ -283,6 +290,79 @@
       <w:r>
         <w:t xml:space="preserve"> (“Lease Term”).</w:t>
       </w:r>
+      <w:r>
+        <w:t xml:space="preserve"> Tenant may provide Landlord with written two-month notice on or before </w:t>
+      </w:r>
+      <w:r>
+        <w:rPr>
+          <w:b/>
+          <w:bCs/>
+        </w:rPr>
+        <w:t>October</w:t>
+      </w:r>
+      <w:r>
+        <w:rPr>
+          <w:b/>
+          <w:bCs/>
+        </w:rPr>
+        <w:t xml:space="preserve"> 30, 2026</w:t>
+      </w:r>
+      <w:r>
+        <w:t xml:space="preserve">. If Tenant provides such notice by </w:t>
+      </w:r>
+      <w:r>
+        <w:t>October</w:t>
+      </w:r>
+      <w:r>
+        <w:t xml:space="preserve"> 30, 2026, Tenant may remain in the premises through </w:t>
+      </w:r>
+      <w:r>
+        <w:rPr>
+          <w:b/>
+          <w:bCs/>
+        </w:rPr>
+        <w:t>December 31</w:t>
+      </w:r>
+      <w:r>
+        <w:rPr>
+          <w:b/>
+          <w:bCs/>
+        </w:rPr>
+        <w:t>, 2026</w:t>
+      </w:r>
+      <w:r>
+        <w:t xml:space="preserve">, subject to all rent, utility, security deposit, access, conduct, maintenance, and other obligations in this Agreement through the move-out date. Beginning on </w:t>
+      </w:r>
+      <w:r>
+        <w:rPr>
+          <w:b/>
+          <w:bCs/>
+        </w:rPr>
+        <w:t xml:space="preserve">October </w:t>
+      </w:r>
+      <w:r>
+        <w:rPr>
+          <w:b/>
+          <w:bCs/>
+        </w:rPr>
+        <w:t>31</w:t>
+      </w:r>
+      <w:r>
+        <w:rPr>
+          <w:b/>
+          <w:bCs/>
+        </w:rPr>
+        <w:t>, 2026</w:t>
+      </w:r>
+      <w:r>
+        <w:t xml:space="preserve">, if Tenant has not provided written two-month notice by </w:t>
+      </w:r>
+      <w:r>
+        <w:t>October</w:t>
+      </w:r>
+      <w:r>
+        <w:t xml:space="preserve"> 30, 2026, all original lease terms shall remain unchanged and fully enforceable for the Lease Term.</w:t>
+      </w:r>
     </w:p>
     <w:p>
       <w:pPr>
@@ -413,6 +493,7 @@
         <w:rPr>
           <w:rFonts w:asciiTheme="minorHAnsi" w:hAnsiTheme="minorHAnsi" w:cstheme="minorBidi"/>
         </w:rPr>
+        <w:lastRenderedPageBreak/>
         <w:t>5</w:t>
       </w:r>
       <w:r>
@@ -464,7 +545,6 @@
         <w:rPr>
           <w:rFonts w:asciiTheme="minorHAnsi" w:hAnsiTheme="minorHAnsi" w:cstheme="minorBidi"/>
         </w:rPr>
-        <w:lastRenderedPageBreak/>
         <w:t>6. Temperature Control &amp; Consumables</w:t>
       </w:r>
     </w:p>
@@ -514,10 +594,7 @@
     </w:p>
     <w:p>
       <w:r>
-        <w:t xml:space="preserve">A </w:t>
-      </w:r>
-      <w:r>
-        <w:t xml:space="preserve">cleaning fee </w:t>
+        <w:t xml:space="preserve">A cleaning fee </w:t>
       </w:r>
       <w:r>
         <w:t xml:space="preserve">of </w:t>
@@ -705,6 +782,7 @@
         <w:rPr>
           <w:rFonts w:asciiTheme="minorHAnsi" w:hAnsiTheme="minorHAnsi" w:cstheme="minorBidi"/>
         </w:rPr>
+        <w:lastRenderedPageBreak/>
         <w:t>12. Governing Law</w:t>
       </w:r>
     </w:p>
@@ -743,7 +821,6 @@
         <w:rPr>
           <w:rFonts w:cstheme="minorBidi"/>
         </w:rPr>
-        <w:lastRenderedPageBreak/>
         <w:t>14</w:t>
       </w:r>
       <w:r>
@@ -758,10 +835,7 @@
         <w:t xml:space="preserve">This Agreement contains the entire understanding between </w:t>
       </w:r>
       <w:r>
-        <w:t xml:space="preserve">Landlord and Tenant and may </w:t>
-      </w:r>
-      <w:r>
-        <w:t xml:space="preserve">be modified </w:t>
+        <w:t xml:space="preserve">Landlord and Tenant and may be modified </w:t>
       </w:r>
       <w:r>
         <w:t>only by a written document</w:t>
@@ -996,7 +1070,7 @@
 </file>
 
 <file path=word/endnotes.xml><?xml version="1.0" encoding="utf-8"?>
-<w:endnotes xmlns:wpc="http://schemas.microsoft.com/office/word/2010/wordprocessingCanvas" xmlns:cx="http://schemas.microsoft.com/office/drawing/2014/chartex" xmlns:cx1="http://schemas.microsoft.com/office/drawing/2015/9/8/chartex" xmlns:cx2="http://schemas.microsoft.com/office/drawing/2015/10/21/chartex" xmlns:cx3="http://schemas.microsoft.com/office/drawing/2016/5/9/chartex" xmlns:cx4="http://schemas.microsoft.com/office/drawing/2016/5/10/chartex" xmlns:cx5="http://schemas.microsoft.com/office/drawing/2016/5/11/chartex" xmlns:cx6="http://schemas.microsoft.com/office/drawing/2016/5/12/chartex" xmlns:cx7="http://schemas.microsoft.com/office/drawing/2016/5/13/chartex" xmlns:cx8="http://schemas.microsoft.com/office/drawing/2016/5/14/chartex" xmlns:mc="http://schemas.openxmlformats.org/markup-compatibility/2006" xmlns:aink="http://schemas.microsoft.com/office/drawing/2016/ink" xmlns:am3d="http://schemas.microsoft.com/office/drawing/2017/model3d" xmlns:o="urn:schemas-microsoft-com:office:office" xmlns:oel="http://schemas.microsoft.com/office/2019/extlst" xmlns:r="http://schemas.openxmlformats.org/officeDocument/2006/relationships" xmlns:m="http://schemas.openxmlformats.org/officeDocument/2006/math" xmlns:v="urn:schemas-microsoft-com:vml" xmlns:wp14="http://schemas.microsoft.com/office/word/2010/wordprocessingDrawing" xmlns:wp="http://schemas.openxmlformats.org/drawingml/2006/wordprocessingDrawing" xmlns:w10="urn:schemas-microsoft-com:office:word" xmlns:w="http://schemas.openxmlformats.org/wordprocessingml/2006/main" xmlns:w14="http://schemas.microsoft.com/office/word/2010/wordml" xmlns:w15="http://schemas.microsoft.com/office/word/2012/wordml" xmlns:w16cei="http://schemas.microsoft.com/office/word/2026/wordml/cei" xmlns:w16cex="http://schemas.microsoft.com/office/word/2018/wordml/cex" xmlns:w16cid="http://schemas.microsoft.com/office/word/2016/wordml/cid" xmlns:w16="http://schemas.microsoft.com/office/word/2018/wordml" xmlns:w16du="http://schemas.microsoft.com/office/word/2023/wordml/word16du" xmlns:w16sdtdh="http://schemas.microsoft.com/office/word/2020/wordml/sdtdatahash" xmlns:w16sdtfl="http://schemas.microsoft.com/office/word/2024/wordml/sdtformatlock" xmlns:w16se="http://schemas.microsoft.com/office/word/2015/wordml/symex" xmlns:wpg="http://schemas.microsoft.com/office/word/2010/wordprocessingGroup" xmlns:wpi="http://schemas.microsoft.com/office/word/2010/wordprocessingInk" xmlns:wne="http://schemas.microsoft.com/office/word/2006/wordml" xmlns:wps="http://schemas.microsoft.com/office/word/2010/wordprocessingShape" mc:Ignorable="w14 w15 w16se w16cid w16 w16cex w16sdtdh w16sdtfl w16du wp14">
+<w:endnotes xmlns:wpc="http://schemas.microsoft.com/office/word/2010/wordprocessingCanvas" xmlns:cx="http://schemas.microsoft.com/office/drawing/2014/chartex" xmlns:cx1="http://schemas.microsoft.com/office/drawing/2015/9/8/chartex" xmlns:cx2="http://schemas.microsoft.com/office/drawing/2015/10/21/chartex" xmlns:cx3="http://schemas.microsoft.com/office/drawing/2016/5/9/chartex" xmlns:cx4="http://schemas.microsoft.com/office/drawing/2016/5/10/chartex" xmlns:cx5="http://schemas.microsoft.com/office/drawing/2016/5/11/chartex" xmlns:cx6="http://schemas.microsoft.com/office/drawing/2016/5/12/chartex" xmlns:cx7="http://schemas.microsoft.com/office/drawing/2016/5/13/chartex" xmlns:cx8="http://schemas.microsoft.com/office/drawing/2016/5/14/chartex" xmlns:mc="http://schemas.openxmlformats.org/markup-compatibility/2006" xmlns:aink="http://schemas.microsoft.com/office/drawing/2016/ink" xmlns:am3d="http://schemas.microsoft.com/office/drawing/2017/model3d" xmlns:o="urn:schemas-microsoft-com:office:office" xmlns:oel="http://schemas.microsoft.com/office/2019/extlst" xmlns:r="http://schemas.openxmlformats.org/officeDocument/2006/relationships" xmlns:m="http://schemas.openxmlformats.org/officeDocument/2006/math" xmlns:v="urn:schemas-microsoft-com:vml" xmlns:wp14="http://schemas.microsoft.com/office/word/2010/wordprocessingDrawing" xmlns:wp="http://schemas.openxmlformats.org/drawingml/2006/wordprocessingDrawing" xmlns:w10="urn:schemas-microsoft-com:office:word" xmlns:w="http://schemas.openxmlformats.org/wordprocessingml/2006/main" xmlns:w14="http://schemas.microsoft.com/office/word/2010/wordml" xmlns:w15="http://schemas.microsoft.com/office/word/2012/wordml" xmlns:w16cex="http://schemas.microsoft.com/office/word/2018/wordml/cex" xmlns:w16cid="http://schemas.microsoft.com/office/word/2016/wordml/cid" xmlns:w16="http://schemas.microsoft.com/office/word/2018/wordml" xmlns:w16du="http://schemas.microsoft.com/office/word/2023/wordml/word16du" xmlns:w16sdtdh="http://schemas.microsoft.com/office/word/2020/wordml/sdtdatahash" xmlns:w16sdtfl="http://schemas.microsoft.com/office/word/2024/wordml/sdtformatlock" xmlns:w16se="http://schemas.microsoft.com/office/word/2015/wordml/symex" xmlns:wpg="http://schemas.microsoft.com/office/word/2010/wordprocessingGroup" xmlns:wpi="http://schemas.microsoft.com/office/word/2010/wordprocessingInk" xmlns:wne="http://schemas.microsoft.com/office/word/2006/wordml" xmlns:wps="http://schemas.microsoft.com/office/word/2010/wordprocessingShape" mc:Ignorable="w14 w15 w16se w16cid w16 w16cex w16sdtdh w16sdtfl w16du wp14">
   <w:endnote w:type="separator" w:id="-1">
     <w:p>
       <w:pPr>
@@ -1021,7 +1095,7 @@
 </file>
 
 <file path=word/footer1.xml><?xml version="1.0" encoding="utf-8"?>
-<w:ftr xmlns:wpc="http://schemas.microsoft.com/office/word/2010/wordprocessingCanvas" xmlns:cx="http://schemas.microsoft.com/office/drawing/2014/chartex" xmlns:cx1="http://schemas.microsoft.com/office/drawing/2015/9/8/chartex" xmlns:cx2="http://schemas.microsoft.com/office/drawing/2015/10/21/chartex" xmlns:cx3="http://schemas.microsoft.com/office/drawing/2016/5/9/chartex" xmlns:cx4="http://schemas.microsoft.com/office/drawing/2016/5/10/chartex" xmlns:cx5="http://schemas.microsoft.com/office/drawing/2016/5/11/chartex" xmlns:cx6="http://schemas.microsoft.com/office/drawing/2016/5/12/chartex" xmlns:cx7="http://schemas.microsoft.com/office/drawing/2016/5/13/chartex" xmlns:cx8="http://schemas.microsoft.com/office/drawing/2016/5/14/chartex" xmlns:mc="http://schemas.openxmlformats.org/markup-compatibility/2006" xmlns:aink="http://schemas.microsoft.com/office/drawing/2016/ink" xmlns:am3d="http://schemas.microsoft.com/office/drawing/2017/model3d" xmlns:o="urn:schemas-microsoft-com:office:office" xmlns:oel="http://schemas.microsoft.com/office/2019/extlst" xmlns:r="http://schemas.openxmlformats.org/officeDocument/2006/relationships" xmlns:m="http://schemas.openxmlformats.org/officeDocument/2006/math" xmlns:v="urn:schemas-microsoft-com:vml" xmlns:wp14="http://schemas.microsoft.com/office/word/2010/wordprocessingDrawing" xmlns:wp="http://schemas.openxmlformats.org/drawingml/2006/wordprocessingDrawing" xmlns:w10="urn:schemas-microsoft-com:office:word" xmlns:w="http://schemas.openxmlformats.org/wordprocessingml/2006/main" xmlns:w14="http://schemas.microsoft.com/office/word/2010/wordml" xmlns:w15="http://schemas.microsoft.com/office/word/2012/wordml" xmlns:w16cei="http://schemas.microsoft.com/office/word/2026/wordml/cei" xmlns:w16cex="http://schemas.microsoft.com/office/word/2018/wordml/cex" xmlns:w16cid="http://schemas.microsoft.com/office/word/2016/wordml/cid" xmlns:w16="http://schemas.microsoft.com/office/word/2018/wordml" xmlns:w16du="http://schemas.microsoft.com/office/word/2023/wordml/word16du" xmlns:w16sdtdh="http://schemas.microsoft.com/office/word/2020/wordml/sdtdatahash" xmlns:w16sdtfl="http://schemas.microsoft.com/office/word/2024/wordml/sdtformatlock" xmlns:w16se="http://schemas.microsoft.com/office/word/2015/wordml/symex" xmlns:wpg="http://schemas.microsoft.com/office/word/2010/wordprocessingGroup" xmlns:wpi="http://schemas.microsoft.com/office/word/2010/wordprocessingInk" xmlns:wne="http://schemas.microsoft.com/office/word/2006/wordml" xmlns:wps="http://schemas.microsoft.com/office/word/2010/wordprocessingShape" mc:Ignorable="w14 w15 w16se w16cid w16 w16cex w16sdtdh w16sdtfl w16du wp14">
+<w:ftr xmlns:wpc="http://schemas.microsoft.com/office/word/2010/wordprocessingCanvas" xmlns:cx="http://schemas.microsoft.com/office/drawing/2014/chartex" xmlns:cx1="http://schemas.microsoft.com/office/drawing/2015/9/8/chartex" xmlns:cx2="http://schemas.microsoft.com/office/drawing/2015/10/21/chartex" xmlns:cx3="http://schemas.microsoft.com/office/drawing/2016/5/9/chartex" xmlns:cx4="http://schemas.microsoft.com/office/drawing/2016/5/10/chartex" xmlns:cx5="http://schemas.microsoft.com/office/drawing/2016/5/11/chartex" xmlns:cx6="http://schemas.microsoft.com/office/drawing/2016/5/12/chartex" xmlns:cx7="http://schemas.microsoft.com/office/drawing/2016/5/13/chartex" xmlns:cx8="http://schemas.microsoft.com/office/drawing/2016/5/14/chartex" xmlns:mc="http://schemas.openxmlformats.org/markup-compatibility/2006" xmlns:aink="http://schemas.microsoft.com/office/drawing/2016/ink" xmlns:am3d="http://schemas.microsoft.com/office/drawing/2017/model3d" xmlns:o="urn:schemas-microsoft-com:office:office" xmlns:oel="http://schemas.microsoft.com/office/2019/extlst" xmlns:r="http://schemas.openxmlformats.org/officeDocument/2006/relationships" xmlns:m="http://schemas.openxmlformats.org/officeDocument/2006/math" xmlns:v="urn:schemas-microsoft-com:vml" xmlns:wp14="http://schemas.microsoft.com/office/word/2010/wordprocessingDrawing" xmlns:wp="http://schemas.openxmlformats.org/drawingml/2006/wordprocessingDrawing" xmlns:w10="urn:schemas-microsoft-com:office:word" xmlns:w="http://schemas.openxmlformats.org/wordprocessingml/2006/main" xmlns:w14="http://schemas.microsoft.com/office/word/2010/wordml" xmlns:w15="http://schemas.microsoft.com/office/word/2012/wordml" xmlns:w16cex="http://schemas.microsoft.com/office/word/2018/wordml/cex" xmlns:w16cid="http://schemas.microsoft.com/office/word/2016/wordml/cid" xmlns:w16="http://schemas.microsoft.com/office/word/2018/wordml" xmlns:w16du="http://schemas.microsoft.com/office/word/2023/wordml/word16du" xmlns:w16sdtdh="http://schemas.microsoft.com/office/word/2020/wordml/sdtdatahash" xmlns:w16sdtfl="http://schemas.microsoft.com/office/word/2024/wordml/sdtformatlock" xmlns:w16se="http://schemas.microsoft.com/office/word/2015/wordml/symex" xmlns:wpg="http://schemas.microsoft.com/office/word/2010/wordprocessingGroup" xmlns:wpi="http://schemas.microsoft.com/office/word/2010/wordprocessingInk" xmlns:wne="http://schemas.microsoft.com/office/word/2006/wordml" xmlns:wps="http://schemas.microsoft.com/office/word/2010/wordprocessingShape" mc:Ignorable="w14 w15 w16se w16cid w16 w16cex w16sdtdh w16sdtfl w16du wp14">
   <w:p>
     <w:pPr>
       <w:pStyle w:val="Footer"/>
@@ -1031,7 +1105,7 @@
 </file>
 
 <file path=word/footer2.xml><?xml version="1.0" encoding="utf-8"?>
-<w:ftr xmlns:wpc="http://schemas.microsoft.com/office/word/2010/wordprocessingCanvas" xmlns:cx="http://schemas.microsoft.com/office/drawing/2014/chartex" xmlns:cx1="http://schemas.microsoft.com/office/drawing/2015/9/8/chartex" xmlns:cx2="http://schemas.microsoft.com/office/drawing/2015/10/21/chartex" xmlns:cx3="http://schemas.microsoft.com/office/drawing/2016/5/9/chartex" xmlns:cx4="http://schemas.microsoft.com/office/drawing/2016/5/10/chartex" xmlns:cx5="http://schemas.microsoft.com/office/drawing/2016/5/11/chartex" xmlns:cx6="http://schemas.microsoft.com/office/drawing/2016/5/12/chartex" xmlns:cx7="http://schemas.microsoft.com/office/drawing/2016/5/13/chartex" xmlns:cx8="http://schemas.microsoft.com/office/drawing/2016/5/14/chartex" xmlns:mc="http://schemas.openxmlformats.org/markup-compatibility/2006" xmlns:aink="http://schemas.microsoft.com/office/drawing/2016/ink" xmlns:am3d="http://schemas.microsoft.com/office/drawing/2017/model3d" xmlns:o="urn:schemas-microsoft-com:office:office" xmlns:oel="http://schemas.microsoft.com/office/2019/extlst" xmlns:r="http://schemas.openxmlformats.org/officeDocument/2006/relationships" xmlns:m="http://schemas.openxmlformats.org/officeDocument/2006/math" xmlns:v="urn:schemas-microsoft-com:vml" xmlns:wp14="http://schemas.microsoft.com/office/word/2010/wordprocessingDrawing" xmlns:wp="http://schemas.openxmlformats.org/drawingml/2006/wordprocessingDrawing" xmlns:w10="urn:schemas-microsoft-com:office:word" xmlns:w="http://schemas.openxmlformats.org/wordprocessingml/2006/main" xmlns:w14="http://schemas.microsoft.com/office/word/2010/wordml" xmlns:w15="http://schemas.microsoft.com/office/word/2012/wordml" xmlns:w16cei="http://schemas.microsoft.com/office/word/2026/wordml/cei" xmlns:w16cex="http://schemas.microsoft.com/office/word/2018/wordml/cex" xmlns:w16cid="http://schemas.microsoft.com/office/word/2016/wordml/cid" xmlns:w16="http://schemas.microsoft.com/office/word/2018/wordml" xmlns:w16du="http://schemas.microsoft.com/office/word/2023/wordml/word16du" xmlns:w16sdtdh="http://schemas.microsoft.com/office/word/2020/wordml/sdtdatahash" xmlns:w16sdtfl="http://schemas.microsoft.com/office/word/2024/wordml/sdtformatlock" xmlns:w16se="http://schemas.microsoft.com/office/word/2015/wordml/symex" xmlns:wpg="http://schemas.microsoft.com/office/word/2010/wordprocessingGroup" xmlns:wpi="http://schemas.microsoft.com/office/word/2010/wordprocessingInk" xmlns:wne="http://schemas.microsoft.com/office/word/2006/wordml" xmlns:wps="http://schemas.microsoft.com/office/word/2010/wordprocessingShape" mc:Ignorable="w14 w15 w16se w16cid w16 w16cex w16sdtdh w16sdtfl w16du wp14">
+<w:ftr xmlns:wpc="http://schemas.microsoft.com/office/word/2010/wordprocessingCanvas" xmlns:cx="http://schemas.microsoft.com/office/drawing/2014/chartex" xmlns:cx1="http://schemas.microsoft.com/office/drawing/2015/9/8/chartex" xmlns:cx2="http://schemas.microsoft.com/office/drawing/2015/10/21/chartex" xmlns:cx3="http://schemas.microsoft.com/office/drawing/2016/5/9/chartex" xmlns:cx4="http://schemas.microsoft.com/office/drawing/2016/5/10/chartex" xmlns:cx5="http://schemas.microsoft.com/office/drawing/2016/5/11/chartex" xmlns:cx6="http://schemas.microsoft.com/office/drawing/2016/5/12/chartex" xmlns:cx7="http://schemas.microsoft.com/office/drawing/2016/5/13/chartex" xmlns:cx8="http://schemas.microsoft.com/office/drawing/2016/5/14/chartex" xmlns:mc="http://schemas.openxmlformats.org/markup-compatibility/2006" xmlns:aink="http://schemas.microsoft.com/office/drawing/2016/ink" xmlns:am3d="http://schemas.microsoft.com/office/drawing/2017/model3d" xmlns:o="urn:schemas-microsoft-com:office:office" xmlns:oel="http://schemas.microsoft.com/office/2019/extlst" xmlns:r="http://schemas.openxmlformats.org/officeDocument/2006/relationships" xmlns:m="http://schemas.openxmlformats.org/officeDocument/2006/math" xmlns:v="urn:schemas-microsoft-com:vml" xmlns:wp14="http://schemas.microsoft.com/office/word/2010/wordprocessingDrawing" xmlns:wp="http://schemas.openxmlformats.org/drawingml/2006/wordprocessingDrawing" xmlns:w10="urn:schemas-microsoft-com:office:word" xmlns:w="http://schemas.openxmlformats.org/wordprocessingml/2006/main" xmlns:w14="http://schemas.microsoft.com/office/word/2010/wordml" xmlns:w15="http://schemas.microsoft.com/office/word/2012/wordml" xmlns:w16cex="http://schemas.microsoft.com/office/word/2018/wordml/cex" xmlns:w16cid="http://schemas.microsoft.com/office/word/2016/wordml/cid" xmlns:w16="http://schemas.microsoft.com/office/word/2018/wordml" xmlns:w16du="http://schemas.microsoft.com/office/word/2023/wordml/word16du" xmlns:w16sdtdh="http://schemas.microsoft.com/office/word/2020/wordml/sdtdatahash" xmlns:w16sdtfl="http://schemas.microsoft.com/office/word/2024/wordml/sdtformatlock" xmlns:w16se="http://schemas.microsoft.com/office/word/2015/wordml/symex" xmlns:wpg="http://schemas.microsoft.com/office/word/2010/wordprocessingGroup" xmlns:wpi="http://schemas.microsoft.com/office/word/2010/wordprocessingInk" xmlns:wne="http://schemas.microsoft.com/office/word/2006/wordml" xmlns:wps="http://schemas.microsoft.com/office/word/2010/wordprocessingShape" mc:Ignorable="w14 w15 w16se w16cid w16 w16cex w16sdtdh w16sdtfl w16du wp14">
   <w:p>
     <w:pPr>
       <w:pStyle w:val="Footer"/>
@@ -1090,7 +1164,7 @@
 </file>
 
 <file path=word/footer3.xml><?xml version="1.0" encoding="utf-8"?>
-<w:ftr xmlns:wpc="http://schemas.microsoft.com/office/word/2010/wordprocessingCanvas" xmlns:cx="http://schemas.microsoft.com/office/drawing/2014/chartex" xmlns:cx1="http://schemas.microsoft.com/office/drawing/2015/9/8/chartex" xmlns:cx2="http://schemas.microsoft.com/office/drawing/2015/10/21/chartex" xmlns:cx3="http://schemas.microsoft.com/office/drawing/2016/5/9/chartex" xmlns:cx4="http://schemas.microsoft.com/office/drawing/2016/5/10/chartex" xmlns:cx5="http://schemas.microsoft.com/office/drawing/2016/5/11/chartex" xmlns:cx6="http://schemas.microsoft.com/office/drawing/2016/5/12/chartex" xmlns:cx7="http://schemas.microsoft.com/office/drawing/2016/5/13/chartex" xmlns:cx8="http://schemas.microsoft.com/office/drawing/2016/5/14/chartex" xmlns:mc="http://schemas.openxmlformats.org/markup-compatibility/2006" xmlns:aink="http://schemas.microsoft.com/office/drawing/2016/ink" xmlns:am3d="http://schemas.microsoft.com/office/drawing/2017/model3d" xmlns:o="urn:schemas-microsoft-com:office:office" xmlns:oel="http://schemas.microsoft.com/office/2019/extlst" xmlns:r="http://schemas.openxmlformats.org/officeDocument/2006/relationships" xmlns:m="http://schemas.openxmlformats.org/officeDocument/2006/math" xmlns:v="urn:schemas-microsoft-com:vml" xmlns:wp14="http://schemas.microsoft.com/office/word/2010/wordprocessingDrawing" xmlns:wp="http://schemas.openxmlformats.org/drawingml/2006/wordprocessingDrawing" xmlns:w10="urn:schemas-microsoft-com:office:word" xmlns:w="http://schemas.openxmlformats.org/wordprocessingml/2006/main" xmlns:w14="http://schemas.microsoft.com/office/word/2010/wordml" xmlns:w15="http://schemas.microsoft.com/office/word/2012/wordml" xmlns:w16cei="http://schemas.microsoft.com/office/word/2026/wordml/cei" xmlns:w16cex="http://schemas.microsoft.com/office/word/2018/wordml/cex" xmlns:w16cid="http://schemas.microsoft.com/office/word/2016/wordml/cid" xmlns:w16="http://schemas.microsoft.com/office/word/2018/wordml" xmlns:w16du="http://schemas.microsoft.com/office/word/2023/wordml/word16du" xmlns:w16sdtdh="http://schemas.microsoft.com/office/word/2020/wordml/sdtdatahash" xmlns:w16sdtfl="http://schemas.microsoft.com/office/word/2024/wordml/sdtformatlock" xmlns:w16se="http://schemas.microsoft.com/office/word/2015/wordml/symex" xmlns:wpg="http://schemas.microsoft.com/office/word/2010/wordprocessingGroup" xmlns:wpi="http://schemas.microsoft.com/office/word/2010/wordprocessingInk" xmlns:wne="http://schemas.microsoft.com/office/word/2006/wordml" xmlns:wps="http://schemas.microsoft.com/office/word/2010/wordprocessingShape" mc:Ignorable="w14 w15 w16se w16cid w16 w16cex w16sdtdh w16sdtfl w16du wp14">
+<w:ftr xmlns:wpc="http://schemas.microsoft.com/office/word/2010/wordprocessingCanvas" xmlns:cx="http://schemas.microsoft.com/office/drawing/2014/chartex" xmlns:cx1="http://schemas.microsoft.com/office/drawing/2015/9/8/chartex" xmlns:cx2="http://schemas.microsoft.com/office/drawing/2015/10/21/chartex" xmlns:cx3="http://schemas.microsoft.com/office/drawing/2016/5/9/chartex" xmlns:cx4="http://schemas.microsoft.com/office/drawing/2016/5/10/chartex" xmlns:cx5="http://schemas.microsoft.com/office/drawing/2016/5/11/chartex" xmlns:cx6="http://schemas.microsoft.com/office/drawing/2016/5/12/chartex" xmlns:cx7="http://schemas.microsoft.com/office/drawing/2016/5/13/chartex" xmlns:cx8="http://schemas.microsoft.com/office/drawing/2016/5/14/chartex" xmlns:mc="http://schemas.openxmlformats.org/markup-compatibility/2006" xmlns:aink="http://schemas.microsoft.com/office/drawing/2016/ink" xmlns:am3d="http://schemas.microsoft.com/office/drawing/2017/model3d" xmlns:o="urn:schemas-microsoft-com:office:office" xmlns:oel="http://schemas.microsoft.com/office/2019/extlst" xmlns:r="http://schemas.openxmlformats.org/officeDocument/2006/relationships" xmlns:m="http://schemas.openxmlformats.org/officeDocument/2006/math" xmlns:v="urn:schemas-microsoft-com:vml" xmlns:wp14="http://schemas.microsoft.com/office/word/2010/wordprocessingDrawing" xmlns:wp="http://schemas.openxmlformats.org/drawingml/2006/wordprocessingDrawing" xmlns:w10="urn:schemas-microsoft-com:office:word" xmlns:w="http://schemas.openxmlformats.org/wordprocessingml/2006/main" xmlns:w14="http://schemas.microsoft.com/office/word/2010/wordml" xmlns:w15="http://schemas.microsoft.com/office/word/2012/wordml" xmlns:w16cex="http://schemas.microsoft.com/office/word/2018/wordml/cex" xmlns:w16cid="http://schemas.microsoft.com/office/word/2016/wordml/cid" xmlns:w16="http://schemas.microsoft.com/office/word/2018/wordml" xmlns:w16du="http://schemas.microsoft.com/office/word/2023/wordml/word16du" xmlns:w16sdtdh="http://schemas.microsoft.com/office/word/2020/wordml/sdtdatahash" xmlns:w16sdtfl="http://schemas.microsoft.com/office/word/2024/wordml/sdtformatlock" xmlns:w16se="http://schemas.microsoft.com/office/word/2015/wordml/symex" xmlns:wpg="http://schemas.microsoft.com/office/word/2010/wordprocessingGroup" xmlns:wpi="http://schemas.microsoft.com/office/word/2010/wordprocessingInk" xmlns:wne="http://schemas.microsoft.com/office/word/2006/wordml" xmlns:wps="http://schemas.microsoft.com/office/word/2010/wordprocessingShape" mc:Ignorable="w14 w15 w16se w16cid w16 w16cex w16sdtdh w16sdtfl w16du wp14">
   <w:p>
     <w:pPr>
       <w:pStyle w:val="Footer"/>
@@ -1100,7 +1174,7 @@
 </file>
 
 <file path=word/footnotes.xml><?xml version="1.0" encoding="utf-8"?>
-<w:footnotes xmlns:wpc="http://schemas.microsoft.com/office/word/2010/wordprocessingCanvas" xmlns:cx="http://schemas.microsoft.com/office/drawing/2014/chartex" xmlns:cx1="http://schemas.microsoft.com/office/drawing/2015/9/8/chartex" xmlns:cx2="http://schemas.microsoft.com/office/drawing/2015/10/21/chartex" xmlns:cx3="http://schemas.microsoft.com/office/drawing/2016/5/9/chartex" xmlns:cx4="http://schemas.microsoft.com/office/drawing/2016/5/10/chartex" xmlns:cx5="http://schemas.microsoft.com/office/drawing/2016/5/11/chartex" xmlns:cx6="http://schemas.microsoft.com/office/drawing/2016/5/12/chartex" xmlns:cx7="http://schemas.microsoft.com/office/drawing/2016/5/13/chartex" xmlns:cx8="http://schemas.microsoft.com/office/drawing/2016/5/14/chartex" xmlns:mc="http://schemas.openxmlformats.org/markup-compatibility/2006" xmlns:aink="http://schemas.microsoft.com/office/drawing/2016/ink" xmlns:am3d="http://schemas.microsoft.com/office/drawing/2017/model3d" xmlns:o="urn:schemas-microsoft-com:office:office" xmlns:oel="http://schemas.microsoft.com/office/2019/extlst" xmlns:r="http://schemas.openxmlformats.org/officeDocument/2006/relationships" xmlns:m="http://schemas.openxmlformats.org/officeDocument/2006/math" xmlns:v="urn:schemas-microsoft-com:vml" xmlns:wp14="http://schemas.microsoft.com/office/word/2010/wordprocessingDrawing" xmlns:wp="http://schemas.openxmlformats.org/drawingml/2006/wordprocessingDrawing" xmlns:w10="urn:schemas-microsoft-com:office:word" xmlns:w="http://schemas.openxmlformats.org/wordprocessingml/2006/main" xmlns:w14="http://schemas.microsoft.com/office/word/2010/wordml" xmlns:w15="http://schemas.microsoft.com/office/word/2012/wordml" xmlns:w16cei="http://schemas.microsoft.com/office/word/2026/wordml/cei" xmlns:w16cex="http://schemas.microsoft.com/office/word/2018/wordml/cex" xmlns:w16cid="http://schemas.microsoft.com/office/word/2016/wordml/cid" xmlns:w16="http://schemas.microsoft.com/office/word/2018/wordml" xmlns:w16du="http://schemas.microsoft.com/office/word/2023/wordml/word16du" xmlns:w16sdtdh="http://schemas.microsoft.com/office/word/2020/wordml/sdtdatahash" xmlns:w16sdtfl="http://schemas.microsoft.com/office/word/2024/wordml/sdtformatlock" xmlns:w16se="http://schemas.microsoft.com/office/word/2015/wordml/symex" xmlns:wpg="http://schemas.microsoft.com/office/word/2010/wordprocessingGroup" xmlns:wpi="http://schemas.microsoft.com/office/word/2010/wordprocessingInk" xmlns:wne="http://schemas.microsoft.com/office/word/2006/wordml" xmlns:wps="http://schemas.microsoft.com/office/word/2010/wordprocessingShape" mc:Ignorable="w14 w15 w16se w16cid w16 w16cex w16sdtdh w16sdtfl w16du wp14">
+<w:footnotes xmlns:wpc="http://schemas.microsoft.com/office/word/2010/wordprocessingCanvas" xmlns:cx="http://schemas.microsoft.com/office/drawing/2014/chartex" xmlns:cx1="http://schemas.microsoft.com/office/drawing/2015/9/8/chartex" xmlns:cx2="http://schemas.microsoft.com/office/drawing/2015/10/21/chartex" xmlns:cx3="http://schemas.microsoft.com/office/drawing/2016/5/9/chartex" xmlns:cx4="http://schemas.microsoft.com/office/drawing/2016/5/10/chartex" xmlns:cx5="http://schemas.microsoft.com/office/drawing/2016/5/11/chartex" xmlns:cx6="http://schemas.microsoft.com/office/drawing/2016/5/12/chartex" xmlns:cx7="http://schemas.microsoft.com/office/drawing/2016/5/13/chartex" xmlns:cx8="http://schemas.microsoft.com/office/drawing/2016/5/14/chartex" xmlns:mc="http://schemas.openxmlformats.org/markup-compatibility/2006" xmlns:aink="http://schemas.microsoft.com/office/drawing/2016/ink" xmlns:am3d="http://schemas.microsoft.com/office/drawing/2017/model3d" xmlns:o="urn:schemas-microsoft-com:office:office" xmlns:oel="http://schemas.microsoft.com/office/2019/extlst" xmlns:r="http://schemas.openxmlformats.org/officeDocument/2006/relationships" xmlns:m="http://schemas.openxmlformats.org/officeDocument/2006/math" xmlns:v="urn:schemas-microsoft-com:vml" xmlns:wp14="http://schemas.microsoft.com/office/word/2010/wordprocessingDrawing" xmlns:wp="http://schemas.openxmlformats.org/drawingml/2006/wordprocessingDrawing" xmlns:w10="urn:schemas-microsoft-com:office:word" xmlns:w="http://schemas.openxmlformats.org/wordprocessingml/2006/main" xmlns:w14="http://schemas.microsoft.com/office/word/2010/wordml" xmlns:w15="http://schemas.microsoft.com/office/word/2012/wordml" xmlns:w16cex="http://schemas.microsoft.com/office/word/2018/wordml/cex" xmlns:w16cid="http://schemas.microsoft.com/office/word/2016/wordml/cid" xmlns:w16="http://schemas.microsoft.com/office/word/2018/wordml" xmlns:w16du="http://schemas.microsoft.com/office/word/2023/wordml/word16du" xmlns:w16sdtdh="http://schemas.microsoft.com/office/word/2020/wordml/sdtdatahash" xmlns:w16sdtfl="http://schemas.microsoft.com/office/word/2024/wordml/sdtformatlock" xmlns:w16se="http://schemas.microsoft.com/office/word/2015/wordml/symex" xmlns:wpg="http://schemas.microsoft.com/office/word/2010/wordprocessingGroup" xmlns:wpi="http://schemas.microsoft.com/office/word/2010/wordprocessingInk" xmlns:wne="http://schemas.microsoft.com/office/word/2006/wordml" xmlns:wps="http://schemas.microsoft.com/office/word/2010/wordprocessingShape" mc:Ignorable="w14 w15 w16se w16cid w16 w16cex w16sdtdh w16sdtfl w16du wp14">
   <w:footnote w:type="separator" w:id="-1">
     <w:p>
       <w:pPr>
@@ -1125,7 +1199,7 @@
 </file>
 
 <file path=word/header1.xml><?xml version="1.0" encoding="utf-8"?>
-<w:hdr xmlns:wpc="http://schemas.microsoft.com/office/word/2010/wordprocessingCanvas" xmlns:cx="http://schemas.microsoft.com/office/drawing/2014/chartex" xmlns:cx1="http://schemas.microsoft.com/office/drawing/2015/9/8/chartex" xmlns:cx2="http://schemas.microsoft.com/office/drawing/2015/10/21/chartex" xmlns:cx3="http://schemas.microsoft.com/office/drawing/2016/5/9/chartex" xmlns:cx4="http://schemas.microsoft.com/office/drawing/2016/5/10/chartex" xmlns:cx5="http://schemas.microsoft.com/office/drawing/2016/5/11/chartex" xmlns:cx6="http://schemas.microsoft.com/office/drawing/2016/5/12/chartex" xmlns:cx7="http://schemas.microsoft.com/office/drawing/2016/5/13/chartex" xmlns:cx8="http://schemas.microsoft.com/office/drawing/2016/5/14/chartex" xmlns:mc="http://schemas.openxmlformats.org/markup-compatibility/2006" xmlns:aink="http://schemas.microsoft.com/office/drawing/2016/ink" xmlns:am3d="http://schemas.microsoft.com/office/drawing/2017/model3d" xmlns:o="urn:schemas-microsoft-com:office:office" xmlns:oel="http://schemas.microsoft.com/office/2019/extlst" xmlns:r="http://schemas.openxmlformats.org/officeDocument/2006/relationships" xmlns:m="http://schemas.openxmlformats.org/officeDocument/2006/math" xmlns:v="urn:schemas-microsoft-com:vml" xmlns:wp14="http://schemas.microsoft.com/office/word/2010/wordprocessingDrawing" xmlns:wp="http://schemas.openxmlformats.org/drawingml/2006/wordprocessingDrawing" xmlns:w10="urn:schemas-microsoft-com:office:word" xmlns:w="http://schemas.openxmlformats.org/wordprocessingml/2006/main" xmlns:w14="http://schemas.microsoft.com/office/word/2010/wordml" xmlns:w15="http://schemas.microsoft.com/office/word/2012/wordml" xmlns:w16cei="http://schemas.microsoft.com/office/word/2026/wordml/cei" xmlns:w16cex="http://schemas.microsoft.com/office/word/2018/wordml/cex" xmlns:w16cid="http://schemas.microsoft.com/office/word/2016/wordml/cid" xmlns:w16="http://schemas.microsoft.com/office/word/2018/wordml" xmlns:w16du="http://schemas.microsoft.com/office/word/2023/wordml/word16du" xmlns:w16sdtdh="http://schemas.microsoft.com/office/word/2020/wordml/sdtdatahash" xmlns:w16sdtfl="http://schemas.microsoft.com/office/word/2024/wordml/sdtformatlock" xmlns:w16se="http://schemas.microsoft.com/office/word/2015/wordml/symex" xmlns:wpg="http://schemas.microsoft.com/office/word/2010/wordprocessingGroup" xmlns:wpi="http://schemas.microsoft.com/office/word/2010/wordprocessingInk" xmlns:wne="http://schemas.microsoft.com/office/word/2006/wordml" xmlns:wps="http://schemas.microsoft.com/office/word/2010/wordprocessingShape" mc:Ignorable="w14 w15 w16se w16cid w16 w16cex w16sdtdh w16sdtfl w16du wp14">
+<w:hdr xmlns:wpc="http://schemas.microsoft.com/office/word/2010/wordprocessingCanvas" xmlns:cx="http://schemas.microsoft.com/office/drawing/2014/chartex" xmlns:cx1="http://schemas.microsoft.com/office/drawing/2015/9/8/chartex" xmlns:cx2="http://schemas.microsoft.com/office/drawing/2015/10/21/chartex" xmlns:cx3="http://schemas.microsoft.com/office/drawing/2016/5/9/chartex" xmlns:cx4="http://schemas.microsoft.com/office/drawing/2016/5/10/chartex" xmlns:cx5="http://schemas.microsoft.com/office/drawing/2016/5/11/chartex" xmlns:cx6="http://schemas.microsoft.com/office/drawing/2016/5/12/chartex" xmlns:cx7="http://schemas.microsoft.com/office/drawing/2016/5/13/chartex" xmlns:cx8="http://schemas.microsoft.com/office/drawing/2016/5/14/chartex" xmlns:mc="http://schemas.openxmlformats.org/markup-compatibility/2006" xmlns:aink="http://schemas.microsoft.com/office/drawing/2016/ink" xmlns:am3d="http://schemas.microsoft.com/office/drawing/2017/model3d" xmlns:o="urn:schemas-microsoft-com:office:office" xmlns:oel="http://schemas.microsoft.com/office/2019/extlst" xmlns:r="http://schemas.openxmlformats.org/officeDocument/2006/relationships" xmlns:m="http://schemas.openxmlformats.org/officeDocument/2006/math" xmlns:v="urn:schemas-microsoft-com:vml" xmlns:wp14="http://schemas.microsoft.com/office/word/2010/wordprocessingDrawing" xmlns:wp="http://schemas.openxmlformats.org/drawingml/2006/wordprocessingDrawing" xmlns:w10="urn:schemas-microsoft-com:office:word" xmlns:w="http://schemas.openxmlformats.org/wordprocessingml/2006/main" xmlns:w14="http://schemas.microsoft.com/office/word/2010/wordml" xmlns:w15="http://schemas.microsoft.com/office/word/2012/wordml" xmlns:w16cex="http://schemas.microsoft.com/office/word/2018/wordml/cex" xmlns:w16cid="http://schemas.microsoft.com/office/word/2016/wordml/cid" xmlns:w16="http://schemas.microsoft.com/office/word/2018/wordml" xmlns:w16du="http://schemas.microsoft.com/office/word/2023/wordml/word16du" xmlns:w16sdtdh="http://schemas.microsoft.com/office/word/2020/wordml/sdtdatahash" xmlns:w16sdtfl="http://schemas.microsoft.com/office/word/2024/wordml/sdtformatlock" xmlns:w16se="http://schemas.microsoft.com/office/word/2015/wordml/symex" xmlns:wpg="http://schemas.microsoft.com/office/word/2010/wordprocessingGroup" xmlns:wpi="http://schemas.microsoft.com/office/word/2010/wordprocessingInk" xmlns:wne="http://schemas.microsoft.com/office/word/2006/wordml" xmlns:wps="http://schemas.microsoft.com/office/word/2010/wordprocessingShape" mc:Ignorable="w14 w15 w16se w16cid w16 w16cex w16sdtdh w16sdtfl w16du wp14">
   <w:p>
     <w:pPr>
       <w:pStyle w:val="Header"/>
@@ -1135,7 +1209,7 @@
 </file>
 
 <file path=word/header2.xml><?xml version="1.0" encoding="utf-8"?>
-<w:hdr xmlns:wpc="http://schemas.microsoft.com/office/word/2010/wordprocessingCanvas" xmlns:cx="http://schemas.microsoft.com/office/drawing/2014/chartex" xmlns:cx1="http://schemas.microsoft.com/office/drawing/2015/9/8/chartex" xmlns:cx2="http://schemas.microsoft.com/office/drawing/2015/10/21/chartex" xmlns:cx3="http://schemas.microsoft.com/office/drawing/2016/5/9/chartex" xmlns:cx4="http://schemas.microsoft.com/office/drawing/2016/5/10/chartex" xmlns:cx5="http://schemas.microsoft.com/office/drawing/2016/5/11/chartex" xmlns:cx6="http://schemas.microsoft.com/office/drawing/2016/5/12/chartex" xmlns:cx7="http://schemas.microsoft.com/office/drawing/2016/5/13/chartex" xmlns:cx8="http://schemas.microsoft.com/office/drawing/2016/5/14/chartex" xmlns:mc="http://schemas.openxmlformats.org/markup-compatibility/2006" xmlns:aink="http://schemas.microsoft.com/office/drawing/2016/ink" xmlns:am3d="http://schemas.microsoft.com/office/drawing/2017/model3d" xmlns:o="urn:schemas-microsoft-com:office:office" xmlns:oel="http://schemas.microsoft.com/office/2019/extlst" xmlns:r="http://schemas.openxmlformats.org/officeDocument/2006/relationships" xmlns:m="http://schemas.openxmlformats.org/officeDocument/2006/math" xmlns:v="urn:schemas-microsoft-com:vml" xmlns:wp14="http://schemas.microsoft.com/office/word/2010/wordprocessingDrawing" xmlns:wp="http://schemas.openxmlformats.org/drawingml/2006/wordprocessingDrawing" xmlns:w10="urn:schemas-microsoft-com:office:word" xmlns:w="http://schemas.openxmlformats.org/wordprocessingml/2006/main" xmlns:w14="http://schemas.microsoft.com/office/word/2010/wordml" xmlns:w15="http://schemas.microsoft.com/office/word/2012/wordml" xmlns:w16cei="http://schemas.microsoft.com/office/word/2026/wordml/cei" xmlns:w16cex="http://schemas.microsoft.com/office/word/2018/wordml/cex" xmlns:w16cid="http://schemas.microsoft.com/office/word/2016/wordml/cid" xmlns:w16="http://schemas.microsoft.com/office/word/2018/wordml" xmlns:w16du="http://schemas.microsoft.com/office/word/2023/wordml/word16du" xmlns:w16sdtdh="http://schemas.microsoft.com/office/word/2020/wordml/sdtdatahash" xmlns:w16sdtfl="http://schemas.microsoft.com/office/word/2024/wordml/sdtformatlock" xmlns:w16se="http://schemas.microsoft.com/office/word/2015/wordml/symex" xmlns:wpg="http://schemas.microsoft.com/office/word/2010/wordprocessingGroup" xmlns:wpi="http://schemas.microsoft.com/office/word/2010/wordprocessingInk" xmlns:wne="http://schemas.microsoft.com/office/word/2006/wordml" xmlns:wps="http://schemas.microsoft.com/office/word/2010/wordprocessingShape" mc:Ignorable="w14 w15 w16se w16cid w16 w16cex w16sdtdh w16sdtfl w16du wp14">
+<w:hdr xmlns:wpc="http://schemas.microsoft.com/office/word/2010/wordprocessingCanvas" xmlns:cx="http://schemas.microsoft.com/office/drawing/2014/chartex" xmlns:cx1="http://schemas.microsoft.com/office/drawing/2015/9/8/chartex" xmlns:cx2="http://schemas.microsoft.com/office/drawing/2015/10/21/chartex" xmlns:cx3="http://schemas.microsoft.com/office/drawing/2016/5/9/chartex" xmlns:cx4="http://schemas.microsoft.com/office/drawing/2016/5/10/chartex" xmlns:cx5="http://schemas.microsoft.com/office/drawing/2016/5/11/chartex" xmlns:cx6="http://schemas.microsoft.com/office/drawing/2016/5/12/chartex" xmlns:cx7="http://schemas.microsoft.com/office/drawing/2016/5/13/chartex" xmlns:cx8="http://schemas.microsoft.com/office/drawing/2016/5/14/chartex" xmlns:mc="http://schemas.openxmlformats.org/markup-compatibility/2006" xmlns:aink="http://schemas.microsoft.com/office/drawing/2016/ink" xmlns:am3d="http://schemas.microsoft.com/office/drawing/2017/model3d" xmlns:o="urn:schemas-microsoft-com:office:office" xmlns:oel="http://schemas.microsoft.com/office/2019/extlst" xmlns:r="http://schemas.openxmlformats.org/officeDocument/2006/relationships" xmlns:m="http://schemas.openxmlformats.org/officeDocument/2006/math" xmlns:v="urn:schemas-microsoft-com:vml" xmlns:wp14="http://schemas.microsoft.com/office/word/2010/wordprocessingDrawing" xmlns:wp="http://schemas.openxmlformats.org/drawingml/2006/wordprocessingDrawing" xmlns:w10="urn:schemas-microsoft-com:office:word" xmlns:w="http://schemas.openxmlformats.org/wordprocessingml/2006/main" xmlns:w14="http://schemas.microsoft.com/office/word/2010/wordml" xmlns:w15="http://schemas.microsoft.com/office/word/2012/wordml" xmlns:w16cex="http://schemas.microsoft.com/office/word/2018/wordml/cex" xmlns:w16cid="http://schemas.microsoft.com/office/word/2016/wordml/cid" xmlns:w16="http://schemas.microsoft.com/office/word/2018/wordml" xmlns:w16du="http://schemas.microsoft.com/office/word/2023/wordml/word16du" xmlns:w16sdtdh="http://schemas.microsoft.com/office/word/2020/wordml/sdtdatahash" xmlns:w16sdtfl="http://schemas.microsoft.com/office/word/2024/wordml/sdtformatlock" xmlns:w16se="http://schemas.microsoft.com/office/word/2015/wordml/symex" xmlns:wpg="http://schemas.microsoft.com/office/word/2010/wordprocessingGroup" xmlns:wpi="http://schemas.microsoft.com/office/word/2010/wordprocessingInk" xmlns:wne="http://schemas.microsoft.com/office/word/2006/wordml" xmlns:wps="http://schemas.microsoft.com/office/word/2010/wordprocessingShape" mc:Ignorable="w14 w15 w16se w16cid w16 w16cex w16sdtdh w16sdtfl w16du wp14">
   <w:p>
     <w:pPr>
       <w:pStyle w:val="Header"/>
@@ -1145,7 +1219,7 @@
 </file>
 
 <file path=word/header3.xml><?xml version="1.0" encoding="utf-8"?>
-<w:hdr xmlns:wpc="http://schemas.microsoft.com/office/word/2010/wordprocessingCanvas" xmlns:cx="http://schemas.microsoft.com/office/drawing/2014/chartex" xmlns:cx1="http://schemas.microsoft.com/office/drawing/2015/9/8/chartex" xmlns:cx2="http://schemas.microsoft.com/office/drawing/2015/10/21/chartex" xmlns:cx3="http://schemas.microsoft.com/office/drawing/2016/5/9/chartex" xmlns:cx4="http://schemas.microsoft.com/office/drawing/2016/5/10/chartex" xmlns:cx5="http://schemas.microsoft.com/office/drawing/2016/5/11/chartex" xmlns:cx6="http://schemas.microsoft.com/office/drawing/2016/5/12/chartex" xmlns:cx7="http://schemas.microsoft.com/office/drawing/2016/5/13/chartex" xmlns:cx8="http://schemas.microsoft.com/office/drawing/2016/5/14/chartex" xmlns:mc="http://schemas.openxmlformats.org/markup-compatibility/2006" xmlns:aink="http://schemas.microsoft.com/office/drawing/2016/ink" xmlns:am3d="http://schemas.microsoft.com/office/drawing/2017/model3d" xmlns:o="urn:schemas-microsoft-com:office:office" xmlns:oel="http://schemas.microsoft.com/office/2019/extlst" xmlns:r="http://schemas.openxmlformats.org/officeDocument/2006/relationships" xmlns:m="http://schemas.openxmlformats.org/officeDocument/2006/math" xmlns:v="urn:schemas-microsoft-com:vml" xmlns:wp14="http://schemas.microsoft.com/office/word/2010/wordprocessingDrawing" xmlns:wp="http://schemas.openxmlformats.org/drawingml/2006/wordprocessingDrawing" xmlns:w10="urn:schemas-microsoft-com:office:word" xmlns:w="http://schemas.openxmlformats.org/wordprocessingml/2006/main" xmlns:w14="http://schemas.microsoft.com/office/word/2010/wordml" xmlns:w15="http://schemas.microsoft.com/office/word/2012/wordml" xmlns:w16cei="http://schemas.microsoft.com/office/word/2026/wordml/cei" xmlns:w16cex="http://schemas.microsoft.com/office/word/2018/wordml/cex" xmlns:w16cid="http://schemas.microsoft.com/office/word/2016/wordml/cid" xmlns:w16="http://schemas.microsoft.com/office/word/2018/wordml" xmlns:w16du="http://schemas.microsoft.com/office/word/2023/wordml/word16du" xmlns:w16sdtdh="http://schemas.microsoft.com/office/word/2020/wordml/sdtdatahash" xmlns:w16sdtfl="http://schemas.microsoft.com/office/word/2024/wordml/sdtformatlock" xmlns:w16se="http://schemas.microsoft.com/office/word/2015/wordml/symex" xmlns:wpg="http://schemas.microsoft.com/office/word/2010/wordprocessingGroup" xmlns:wpi="http://schemas.microsoft.com/office/word/2010/wordprocessingInk" xmlns:wne="http://schemas.microsoft.com/office/word/2006/wordml" xmlns:wps="http://schemas.microsoft.com/office/word/2010/wordprocessingShape" mc:Ignorable="w14 w15 w16se w16cid w16 w16cex w16sdtdh w16sdtfl w16du wp14">
+<w:hdr xmlns:wpc="http://schemas.microsoft.com/office/word/2010/wordprocessingCanvas" xmlns:cx="http://schemas.microsoft.com/office/drawing/2014/chartex" xmlns:cx1="http://schemas.microsoft.com/office/drawing/2015/9/8/chartex" xmlns:cx2="http://schemas.microsoft.com/office/drawing/2015/10/21/chartex" xmlns:cx3="http://schemas.microsoft.com/office/drawing/2016/5/9/chartex" xmlns:cx4="http://schemas.microsoft.com/office/drawing/2016/5/10/chartex" xmlns:cx5="http://schemas.microsoft.com/office/drawing/2016/5/11/chartex" xmlns:cx6="http://schemas.microsoft.com/office/drawing/2016/5/12/chartex" xmlns:cx7="http://schemas.microsoft.com/office/drawing/2016/5/13/chartex" xmlns:cx8="http://schemas.microsoft.com/office/drawing/2016/5/14/chartex" xmlns:mc="http://schemas.openxmlformats.org/markup-compatibility/2006" xmlns:aink="http://schemas.microsoft.com/office/drawing/2016/ink" xmlns:am3d="http://schemas.microsoft.com/office/drawing/2017/model3d" xmlns:o="urn:schemas-microsoft-com:office:office" xmlns:oel="http://schemas.microsoft.com/office/2019/extlst" xmlns:r="http://schemas.openxmlformats.org/officeDocument/2006/relationships" xmlns:m="http://schemas.openxmlformats.org/officeDocument/2006/math" xmlns:v="urn:schemas-microsoft-com:vml" xmlns:wp14="http://schemas.microsoft.com/office/word/2010/wordprocessingDrawing" xmlns:wp="http://schemas.openxmlformats.org/drawingml/2006/wordprocessingDrawing" xmlns:w10="urn:schemas-microsoft-com:office:word" xmlns:w="http://schemas.openxmlformats.org/wordprocessingml/2006/main" xmlns:w14="http://schemas.microsoft.com/office/word/2010/wordml" xmlns:w15="http://schemas.microsoft.com/office/word/2012/wordml" xmlns:w16cex="http://schemas.microsoft.com/office/word/2018/wordml/cex" xmlns:w16cid="http://schemas.microsoft.com/office/word/2016/wordml/cid" xmlns:w16="http://schemas.microsoft.com/office/word/2018/wordml" xmlns:w16du="http://schemas.microsoft.com/office/word/2023/wordml/word16du" xmlns:w16sdtdh="http://schemas.microsoft.com/office/word/2020/wordml/sdtdatahash" xmlns:w16sdtfl="http://schemas.microsoft.com/office/word/2024/wordml/sdtformatlock" xmlns:w16se="http://schemas.microsoft.com/office/word/2015/wordml/symex" xmlns:wpg="http://schemas.microsoft.com/office/word/2010/wordprocessingGroup" xmlns:wpi="http://schemas.microsoft.com/office/word/2010/wordprocessingInk" xmlns:wne="http://schemas.microsoft.com/office/word/2006/wordml" xmlns:wps="http://schemas.microsoft.com/office/word/2010/wordprocessingShape" mc:Ignorable="w14 w15 w16se w16cid w16 w16cex w16sdtdh w16sdtfl w16du wp14">
   <w:p>
     <w:pPr>
       <w:pStyle w:val="Header"/>

</xml_diff>